<commit_message>
Redesign CV with NexGen GRC color palette
Applied five-color scheme from NexGen GRC characteristics diagram:
dark navy, teal, deep navy, purple, amber, and crimson accents.

Co-Authored-By: Claude Sonnet 4.6 <noreply@anthropic.com>
Claude-Session: https://claude.ai/code/session_01SdjMkPuL21kEbVLswEiYmz
</commit_message>
<xml_diff>
--- a/output/Ibraheem_Mustafa_GRC_CV.docx
+++ b/output/Ibraheem_Mustafa_GRC_CV.docx
@@ -10,7 +10,7 @@
       <w:r>
         <w:rPr>
           <w:b/>
-          <w:color w:val="1A365C"/>
+          <w:color w:val="1A2D60"/>
           <w:sz w:val="44"/>
         </w:rPr>
         <w:t>IBRAHEEM MUSTAFA</w:t>
@@ -24,7 +24,7 @@
       <w:r>
         <w:rPr>
           <w:b/>
-          <w:color w:val="2C5282"/>
+          <w:color w:val="28AFA0"/>
           <w:sz w:val="24"/>
         </w:rPr>
         <w:t>Information Security Engineer – GRC</w:t>
@@ -45,20 +45,28 @@
     </w:p>
     <w:p>
       <w:pPr>
-        <w:spacing w:before="40" w:after="40"/>
+        <w:spacing w:before="20" w:after="40"/>
         <w:pBdr>
-          <w:bottom w:val="single" w:sz="6" w:space="1" w:color="2C5282"/>
+          <w:bottom w:val="single" w:sz="6" w:space="1" w:color="F5A520"/>
         </w:pBdr>
       </w:pPr>
     </w:p>
     <w:p>
       <w:pPr>
-        <w:spacing w:before="200" w:after="40"/>
+        <w:spacing w:before="20" w:after="40"/>
+        <w:pBdr>
+          <w:bottom w:val="single" w:sz="6" w:space="1" w:color="28AFA0"/>
+        </w:pBdr>
+      </w:pPr>
+    </w:p>
+    <w:p>
+      <w:pPr>
+        <w:spacing w:before="200" w:after="20"/>
       </w:pPr>
       <w:r>
         <w:rPr>
           <w:b/>
-          <w:color w:val="2C5282"/>
+          <w:color w:val="1E3D7A"/>
           <w:sz w:val="22"/>
         </w:rPr>
         <w:t>PROFESSIONAL SUMMARY</w:t>
@@ -66,9 +74,9 @@
     </w:p>
     <w:p>
       <w:pPr>
-        <w:spacing w:before="40" w:after="40"/>
+        <w:spacing w:before="20" w:after="40"/>
         <w:pBdr>
-          <w:bottom w:val="single" w:sz="6" w:space="1" w:color="2C5282"/>
+          <w:bottom w:val="single" w:sz="6" w:space="1" w:color="28AFA0"/>
         </w:pBdr>
       </w:pPr>
     </w:p>
@@ -82,12 +90,12 @@
     </w:p>
     <w:p>
       <w:pPr>
-        <w:spacing w:before="200" w:after="40"/>
+        <w:spacing w:before="200" w:after="20"/>
       </w:pPr>
       <w:r>
         <w:rPr>
           <w:b/>
-          <w:color w:val="2C5282"/>
+          <w:color w:val="1E3D7A"/>
           <w:sz w:val="22"/>
         </w:rPr>
         <w:t>CORE SKILLS</w:t>
@@ -95,9 +103,9 @@
     </w:p>
     <w:p>
       <w:pPr>
-        <w:spacing w:before="40" w:after="40"/>
+        <w:spacing w:before="20" w:after="40"/>
         <w:pBdr>
-          <w:bottom w:val="single" w:sz="6" w:space="1" w:color="2C5282"/>
+          <w:bottom w:val="single" w:sz="6" w:space="1" w:color="6B35A0"/>
         </w:pBdr>
       </w:pPr>
     </w:p>
@@ -111,12 +119,12 @@
     </w:p>
     <w:p>
       <w:pPr>
-        <w:spacing w:before="200" w:after="40"/>
+        <w:spacing w:before="200" w:after="20"/>
       </w:pPr>
       <w:r>
         <w:rPr>
           <w:b/>
-          <w:color w:val="2C5282"/>
+          <w:color w:val="1E3D7A"/>
           <w:sz w:val="22"/>
         </w:rPr>
         <w:t>WORK EXPERIENCE</w:t>
@@ -124,9 +132,9 @@
     </w:p>
     <w:p>
       <w:pPr>
-        <w:spacing w:before="40" w:after="40"/>
+        <w:spacing w:before="20" w:after="40"/>
         <w:pBdr>
-          <w:bottom w:val="single" w:sz="6" w:space="1" w:color="2C5282"/>
+          <w:bottom w:val="single" w:sz="6" w:space="1" w:color="1E3D7A"/>
         </w:pBdr>
       </w:pPr>
     </w:p>
@@ -137,6 +145,7 @@
       <w:r>
         <w:rPr>
           <w:b/>
+          <w:color w:val="1E3D7A"/>
           <w:sz w:val="22"/>
         </w:rPr>
         <w:t>Kualitatem Inc.</w:t>
@@ -149,6 +158,7 @@
       <w:r>
         <w:rPr>
           <w:b/>
+          <w:color w:val="6B35A0"/>
           <w:sz w:val="20"/>
         </w:rPr>
         <w:t>Information Security Engineer – Information Security Department</w:t>
@@ -161,7 +171,7 @@
       <w:r>
         <w:rPr>
           <w:i/>
-          <w:color w:val="666666"/>
+          <w:color w:val="F5A520"/>
           <w:sz w:val="18"/>
         </w:rPr>
         <w:t>December 2023 – Present  |  Lahore, Pakistan</w:t>
@@ -260,12 +270,12 @@
     </w:p>
     <w:p>
       <w:pPr>
-        <w:spacing w:before="200" w:after="40"/>
+        <w:spacing w:before="200" w:after="20"/>
       </w:pPr>
       <w:r>
         <w:rPr>
           <w:b/>
-          <w:color w:val="2C5282"/>
+          <w:color w:val="1E3D7A"/>
           <w:sz w:val="22"/>
         </w:rPr>
         <w:t>EDUCATION</w:t>
@@ -273,9 +283,9 @@
     </w:p>
     <w:p>
       <w:pPr>
-        <w:spacing w:before="40" w:after="40"/>
+        <w:spacing w:before="20" w:after="40"/>
         <w:pBdr>
-          <w:bottom w:val="single" w:sz="6" w:space="1" w:color="2C5282"/>
+          <w:bottom w:val="single" w:sz="6" w:space="1" w:color="28AFA0"/>
         </w:pBdr>
       </w:pPr>
     </w:p>
@@ -286,6 +296,7 @@
       <w:r>
         <w:rPr>
           <w:b/>
+          <w:color w:val="1A2D60"/>
         </w:rPr>
         <w:t>Masters in Cyber Security – CGPA 3.57</w:t>
       </w:r>
@@ -310,6 +321,7 @@
       <w:r>
         <w:rPr>
           <w:b/>
+          <w:color w:val="1A2D60"/>
         </w:rPr>
         <w:t>Bachelors in Computer Science – CGPA 3.40</w:t>
       </w:r>
@@ -329,12 +341,12 @@
     </w:p>
     <w:p>
       <w:pPr>
-        <w:spacing w:before="200" w:after="40"/>
+        <w:spacing w:before="200" w:after="20"/>
       </w:pPr>
       <w:r>
         <w:rPr>
           <w:b/>
-          <w:color w:val="2C5282"/>
+          <w:color w:val="1E3D7A"/>
           <w:sz w:val="22"/>
         </w:rPr>
         <w:t>CERTIFICATIONS</w:t>
@@ -342,9 +354,9 @@
     </w:p>
     <w:p>
       <w:pPr>
-        <w:spacing w:before="40" w:after="40"/>
+        <w:spacing w:before="20" w:after="40"/>
         <w:pBdr>
-          <w:bottom w:val="single" w:sz="6" w:space="1" w:color="2C5282"/>
+          <w:bottom w:val="single" w:sz="6" w:space="1" w:color="C0232B"/>
         </w:pBdr>
       </w:pPr>
     </w:p>
@@ -362,7 +374,7 @@
         <w:tc>
           <w:tcPr>
             <w:tcW w:type="dxa" w:w="4986"/>
-            <w:shd w:val="clear" w:color="auto" w:fill="2C5282"/>
+            <w:shd w:val="clear" w:color="auto" w:fill="1A2D60"/>
           </w:tcPr>
           <w:p>
             <w:r>
@@ -378,7 +390,7 @@
         <w:tc>
           <w:tcPr>
             <w:tcW w:type="dxa" w:w="4986"/>
-            <w:shd w:val="clear" w:color="auto" w:fill="2C5282"/>
+            <w:shd w:val="clear" w:color="auto" w:fill="1A2D60"/>
           </w:tcPr>
           <w:p>
             <w:r>
@@ -396,6 +408,7 @@
         <w:tc>
           <w:tcPr>
             <w:tcW w:type="dxa" w:w="4986"/>
+            <w:shd w:val="clear" w:color="auto" w:fill="F2F4F8"/>
           </w:tcPr>
           <w:p>
             <w:r>
@@ -409,6 +422,7 @@
         <w:tc>
           <w:tcPr>
             <w:tcW w:type="dxa" w:w="4986"/>
+            <w:shd w:val="clear" w:color="auto" w:fill="F2F4F8"/>
           </w:tcPr>
           <w:p>
             <w:r>
@@ -424,6 +438,7 @@
         <w:tc>
           <w:tcPr>
             <w:tcW w:type="dxa" w:w="4986"/>
+            <w:shd w:val="clear" w:color="auto" w:fill="FFFFFF"/>
           </w:tcPr>
           <w:p>
             <w:r>
@@ -437,6 +452,7 @@
         <w:tc>
           <w:tcPr>
             <w:tcW w:type="dxa" w:w="4986"/>
+            <w:shd w:val="clear" w:color="auto" w:fill="FFFFFF"/>
           </w:tcPr>
           <w:p>
             <w:r>
@@ -452,6 +468,7 @@
         <w:tc>
           <w:tcPr>
             <w:tcW w:type="dxa" w:w="4986"/>
+            <w:shd w:val="clear" w:color="auto" w:fill="F2F4F8"/>
           </w:tcPr>
           <w:p>
             <w:r>
@@ -465,6 +482,7 @@
         <w:tc>
           <w:tcPr>
             <w:tcW w:type="dxa" w:w="4986"/>
+            <w:shd w:val="clear" w:color="auto" w:fill="F2F4F8"/>
           </w:tcPr>
           <w:p>
             <w:r>
@@ -480,6 +498,7 @@
         <w:tc>
           <w:tcPr>
             <w:tcW w:type="dxa" w:w="4986"/>
+            <w:shd w:val="clear" w:color="auto" w:fill="FFFFFF"/>
           </w:tcPr>
           <w:p>
             <w:r>
@@ -493,6 +512,7 @@
         <w:tc>
           <w:tcPr>
             <w:tcW w:type="dxa" w:w="4986"/>
+            <w:shd w:val="clear" w:color="auto" w:fill="FFFFFF"/>
           </w:tcPr>
           <w:p>
             <w:r>
@@ -508,12 +528,12 @@
     <w:p/>
     <w:p>
       <w:pPr>
-        <w:spacing w:before="200" w:after="40"/>
+        <w:spacing w:before="200" w:after="20"/>
       </w:pPr>
       <w:r>
         <w:rPr>
           <w:b/>
-          <w:color w:val="2C5282"/>
+          <w:color w:val="1E3D7A"/>
           <w:sz w:val="22"/>
         </w:rPr>
         <w:t>LANGUAGES</w:t>
@@ -521,9 +541,9 @@
     </w:p>
     <w:p>
       <w:pPr>
-        <w:spacing w:before="40" w:after="40"/>
+        <w:spacing w:before="20" w:after="40"/>
         <w:pBdr>
-          <w:bottom w:val="single" w:sz="6" w:space="1" w:color="2C5282"/>
+          <w:bottom w:val="single" w:sz="6" w:space="1" w:color="F5A520"/>
         </w:pBdr>
       </w:pPr>
     </w:p>
@@ -534,6 +554,7 @@
       <w:r>
         <w:rPr>
           <w:b/>
+          <w:color w:val="1E3D7A"/>
         </w:rPr>
         <w:t xml:space="preserve">English: </w:t>
       </w:r>
@@ -548,6 +569,7 @@
       <w:r>
         <w:rPr>
           <w:b/>
+          <w:color w:val="1E3D7A"/>
         </w:rPr>
         <w:t xml:space="preserve">Urdu: </w:t>
       </w:r>
@@ -562,6 +584,7 @@
       <w:r>
         <w:rPr>
           <w:b/>
+          <w:color w:val="1E3D7A"/>
         </w:rPr>
         <w:t xml:space="preserve">Turkish: </w:t>
       </w:r>

</xml_diff>